<commit_message>
docs: Sync from Google Drive (2026-04-27)
</commit_message>
<xml_diff>
--- a/ChronoGrid-wichtige Zusatzdokumente/CG-Letter-of-Intent-TU-Wien_v2.docx
+++ b/ChronoGrid-wichtige Zusatzdokumente/CG-Letter-of-Intent-TU-Wien_v2.docx
@@ -251,7 +251,7 @@
         <w:rPr>
           <w:color w:val="1A1A1A"/>
         </w:rPr>
-        <w:t>ChronoGrid hat ein formales Framework zur maschinenlesbaren Beschreibung beliebiger Zeitdomänen entwickelt, bestehend aus einer Beschreibungssprache (CTDDL), einer deterministischen Berechnungs-Engine und einer normierten API. Das Projekt umfasst einen vollständigen Spezifikationsstack aus 17 Dokumenten; eine Referenzimplementierung mit Level-3-Konformitätszertifikat (72/72 Tests, April 2026) ist abgeschlossen. Angestrebtes Ziel: internationale Standardisierung über ASI/ON, CEN und ISO TC 154.</w:t>
+        <w:t>ChronoGrid hat ein formales Framework zur maschinenlesbaren Beschreibung beliebiger Zeitdomänen entwickelt, bestehend aus einer Beschreibungssprache (CTDDL), einer deterministischen Berechnungs-Engine und einer normierten API. Das Projekt umfasst einen vollständigen Spezifikationsstack aus 19 Dokumenten; eine Referenzimplementierung mit Level-3-Konformitätszertifikat (72/72 Tests, April 2026) ist abgeschlossen. Angestrebtes Ziel: internationale Standardisierung über ASI/ON, CEN und ISO TC 154.</w:t>
       </w:r>
     </w:p>
     <w:p>
@@ -309,7 +309,7 @@
         <w:rPr>
           <w:color w:val="1A1A1A"/>
         </w:rPr>
-        <w:t>•  Vollständigen Spezifikationsstack (17 Dokumente, über 400 Seiten)</w:t>
+        <w:t>•  Vollständigen Spezifikationsstack (19 Dokumente, über 400 Seiten)</w:t>
       </w:r>
     </w:p>
     <w:p>
@@ -1374,7 +1374,7 @@
           <w:sz w:val="17"/>
           <w:szCs w:val="17"/>
         </w:rPr>
-        <w:t>Beilage: ChronoGrid Dokumentenübersicht (CG-DOK-0000-2026 v2.6) mit Übersicht aller 17 Spezifikationsdokumente</w:t>
+        <w:t>Beilage: ChronoGrid Dokumentenübersicht (CG-DOK-0000-2026 v2.7) mit Übersicht aller 19 Spezifikationsdokumente</w:t>
       </w:r>
     </w:p>
     <w:sectPr>

</xml_diff>